<commit_message>
AIML Lab Assignments 1-10 with practical implementations
</commit_message>
<xml_diff>
--- a/Assignments/Aiml Assignment1.docx
+++ b/Assignments/Aiml Assignment1.docx
@@ -38,13 +38,12 @@
           <w:sz w:val="28"/>
           <w:szCs w:val="28"/>
         </w:rPr>
-        <w:t xml:space="preserve">Aim: </w:t>
-      </w:r>
-      <w:r>
-        <w:rPr>
-          <w:rFonts w:ascii="Times New Roman" w:hAnsi="Times New Roman" w:cs="Times New Roman"/>
-        </w:rPr>
-        <w:t>Identify the association between dependent and independent variables.</w:t>
+        <w:t>Aim: Study the association between two variables and measure their relationship using correlation.</w:t>
+      </w:r>
+      <w:r>
+        <w:rPr>
+          <w:rFonts w:ascii="Times New Roman" w:hAnsi="Times New Roman" w:cs="Times New Roman"/>
+        </w:rPr>
       </w:r>
     </w:p>
     <w:p>
@@ -76,20 +75,20 @@
         <w:rPr>
           <w:rFonts w:ascii="Times New Roman" w:hAnsi="Times New Roman" w:cs="Times New Roman"/>
         </w:rPr>
-        <w:t>import pandas as pd</w:t>
-      </w:r>
-    </w:p>
-    <w:p>
-      <w:pPr>
-        <w:rPr>
-          <w:rFonts w:ascii="Times New Roman" w:hAnsi="Times New Roman" w:cs="Times New Roman"/>
-        </w:rPr>
-      </w:pPr>
-      <w:r>
-        <w:rPr>
-          <w:rFonts w:ascii="Times New Roman" w:hAnsi="Times New Roman" w:cs="Times New Roman"/>
-        </w:rPr>
-        <w:t xml:space="preserve">import </w:t>
+        <w:t># Practical: Association Analysis</w:t>
+      </w:r>
+    </w:p>
+    <w:p>
+      <w:pPr>
+        <w:rPr>
+          <w:rFonts w:ascii="Times New Roman" w:hAnsi="Times New Roman" w:cs="Times New Roman"/>
+        </w:rPr>
+      </w:pPr>
+      <w:r>
+        <w:rPr>
+          <w:rFonts w:ascii="Times New Roman" w:hAnsi="Times New Roman" w:cs="Times New Roman"/>
+        </w:rPr>
+        <w:t># Objective: Study the relationship between two variables using</w:t>
       </w:r>
       <w:proofErr w:type="spellStart"/>
       <w:proofErr w:type="gramStart"/>
@@ -97,7 +96,6 @@
         <w:rPr>
           <w:rFonts w:ascii="Times New Roman" w:hAnsi="Times New Roman" w:cs="Times New Roman"/>
         </w:rPr>
-        <w:t>matplotlib.pyplot</w:t>
       </w:r>
       <w:proofErr w:type="spellEnd"/>
       <w:proofErr w:type="gramEnd"/>
@@ -105,14 +103,12 @@
         <w:rPr>
           <w:rFonts w:ascii="Times New Roman" w:hAnsi="Times New Roman" w:cs="Times New Roman"/>
         </w:rPr>
-        <w:t xml:space="preserve"> as </w:t>
       </w:r>
       <w:proofErr w:type="spellStart"/>
       <w:r>
         <w:rPr>
           <w:rFonts w:ascii="Times New Roman" w:hAnsi="Times New Roman" w:cs="Times New Roman"/>
         </w:rPr>
-        <w:t>plt</w:t>
       </w:r>
       <w:proofErr w:type="spellEnd"/>
     </w:p>
@@ -126,14 +122,13 @@
         <w:rPr>
           <w:rFonts w:ascii="Times New Roman" w:hAnsi="Times New Roman" w:cs="Times New Roman"/>
         </w:rPr>
-        <w:t xml:space="preserve">import seaborn as </w:t>
+        <w:t>#            Pearson correlation and visualize it with a scatter plot.</w:t>
       </w:r>
       <w:proofErr w:type="spellStart"/>
       <w:r>
         <w:rPr>
           <w:rFonts w:ascii="Times New Roman" w:hAnsi="Times New Roman" w:cs="Times New Roman"/>
         </w:rPr>
-        <w:t>sns</w:t>
       </w:r>
       <w:proofErr w:type="spellEnd"/>
     </w:p>
@@ -143,92 +138,93 @@
           <w:rFonts w:ascii="Times New Roman" w:hAnsi="Times New Roman" w:cs="Times New Roman"/>
         </w:rPr>
       </w:pPr>
-    </w:p>
-    <w:p>
-      <w:pPr>
-        <w:rPr>
-          <w:rFonts w:ascii="Times New Roman" w:hAnsi="Times New Roman" w:cs="Times New Roman"/>
-        </w:rPr>
-      </w:pPr>
-      <w:r>
-        <w:rPr>
-          <w:rFonts w:ascii="Times New Roman" w:hAnsi="Times New Roman" w:cs="Times New Roman"/>
-        </w:rPr>
-        <w:t># Create dataset</w:t>
-      </w:r>
-    </w:p>
-    <w:p>
-      <w:pPr>
-        <w:rPr>
-          <w:rFonts w:ascii="Times New Roman" w:hAnsi="Times New Roman" w:cs="Times New Roman"/>
-        </w:rPr>
-      </w:pPr>
-      <w:r>
-        <w:rPr>
-          <w:rFonts w:ascii="Times New Roman" w:hAnsi="Times New Roman" w:cs="Times New Roman"/>
-        </w:rPr>
-        <w:t>data = {</w:t>
-      </w:r>
-    </w:p>
-    <w:p>
-      <w:pPr>
-        <w:rPr>
-          <w:rFonts w:ascii="Times New Roman" w:hAnsi="Times New Roman" w:cs="Times New Roman"/>
-        </w:rPr>
-      </w:pPr>
-      <w:r>
-        <w:rPr>
-          <w:rFonts w:ascii="Times New Roman" w:hAnsi="Times New Roman" w:cs="Times New Roman"/>
-        </w:rPr>
-        <w:t>    "</w:t>
+      <w:r/>
+    </w:p>
+    <w:p>
+      <w:pPr>
+        <w:rPr>
+          <w:rFonts w:ascii="Times New Roman" w:hAnsi="Times New Roman" w:cs="Times New Roman"/>
+        </w:rPr>
+      </w:pPr>
+      <w:r>
+        <w:rPr>
+          <w:rFonts w:ascii="Times New Roman" w:hAnsi="Times New Roman" w:cs="Times New Roman"/>
+        </w:rPr>
+        <w:t>import pandas as pd</w:t>
+      </w:r>
+    </w:p>
+    <w:p>
+      <w:pPr>
+        <w:rPr>
+          <w:rFonts w:ascii="Times New Roman" w:hAnsi="Times New Roman" w:cs="Times New Roman"/>
+        </w:rPr>
+      </w:pPr>
+      <w:r>
+        <w:rPr>
+          <w:rFonts w:ascii="Times New Roman" w:hAnsi="Times New Roman" w:cs="Times New Roman"/>
+        </w:rPr>
+        <w:t>import matplotlib.pyplot as plt</w:t>
+      </w:r>
+    </w:p>
+    <w:p>
+      <w:pPr>
+        <w:rPr>
+          <w:rFonts w:ascii="Times New Roman" w:hAnsi="Times New Roman" w:cs="Times New Roman"/>
+        </w:rPr>
+      </w:pPr>
+      <w:r>
+        <w:rPr>
+          <w:rFonts w:ascii="Times New Roman" w:hAnsi="Times New Roman" w:cs="Times New Roman"/>
+        </w:rPr>
+        <w:t>import seaborn as sns</w:t>
       </w:r>
       <w:proofErr w:type="spellStart"/>
       <w:r>
         <w:rPr>
           <w:rFonts w:ascii="Times New Roman" w:hAnsi="Times New Roman" w:cs="Times New Roman"/>
         </w:rPr>
-        <w:t>Hours_Studied</w:t>
       </w:r>
       <w:proofErr w:type="spellEnd"/>
       <w:r>
         <w:rPr>
           <w:rFonts w:ascii="Times New Roman" w:hAnsi="Times New Roman" w:cs="Times New Roman"/>
         </w:rPr>
-        <w:t>": [1, 2, 3, 4, 5, 6, 7, 8, 9, 10],</w:t>
-      </w:r>
-    </w:p>
-    <w:p>
-      <w:pPr>
-        <w:rPr>
-          <w:rFonts w:ascii="Times New Roman" w:hAnsi="Times New Roman" w:cs="Times New Roman"/>
-        </w:rPr>
-      </w:pPr>
-      <w:r>
-        <w:rPr>
-          <w:rFonts w:ascii="Times New Roman" w:hAnsi="Times New Roman" w:cs="Times New Roman"/>
-        </w:rPr>
-        <w:t>    "Marks": [35, 40, 45, 52, 58, 65, 70, 78, 85, 92]</w:t>
-      </w:r>
-    </w:p>
-    <w:p>
-      <w:pPr>
-        <w:rPr>
-          <w:rFonts w:ascii="Times New Roman" w:hAnsi="Times New Roman" w:cs="Times New Roman"/>
-        </w:rPr>
-      </w:pPr>
-      <w:r>
-        <w:rPr>
-          <w:rFonts w:ascii="Times New Roman" w:hAnsi="Times New Roman" w:cs="Times New Roman"/>
-        </w:rPr>
-        <w:t>}</w:t>
-      </w:r>
-    </w:p>
-    <w:p>
-      <w:pPr>
-        <w:rPr>
-          <w:rFonts w:ascii="Times New Roman" w:hAnsi="Times New Roman" w:cs="Times New Roman"/>
-        </w:rPr>
-      </w:pPr>
+      </w:r>
+    </w:p>
+    <w:p>
+      <w:pPr>
+        <w:rPr>
+          <w:rFonts w:ascii="Times New Roman" w:hAnsi="Times New Roman" w:cs="Times New Roman"/>
+        </w:rPr>
+      </w:pPr>
+      <w:r>
+        <w:rPr>
+          <w:rFonts w:ascii="Times New Roman" w:hAnsi="Times New Roman" w:cs="Times New Roman"/>
+        </w:rPr>
+      </w:r>
+    </w:p>
+    <w:p>
+      <w:pPr>
+        <w:rPr>
+          <w:rFonts w:ascii="Times New Roman" w:hAnsi="Times New Roman" w:cs="Times New Roman"/>
+        </w:rPr>
+      </w:pPr>
+      <w:r>
+        <w:rPr>
+          <w:rFonts w:ascii="Times New Roman" w:hAnsi="Times New Roman" w:cs="Times New Roman"/>
+        </w:rPr>
+        <w:t># Step 1: Prepare the dataset</w:t>
+      </w:r>
+    </w:p>
+    <w:p>
+      <w:pPr>
+        <w:rPr>
+          <w:rFonts w:ascii="Times New Roman" w:hAnsi="Times New Roman" w:cs="Times New Roman"/>
+        </w:rPr>
+      </w:pPr>
+      <w:r>
+        <w:t># Sleep hours vs exam score for a group of students</w:t>
+      </w:r>
     </w:p>
     <w:p>
       <w:pPr>
@@ -241,14 +237,13 @@
         <w:rPr>
           <w:rFonts w:ascii="Times New Roman" w:hAnsi="Times New Roman" w:cs="Times New Roman"/>
         </w:rPr>
-        <w:t>df</w:t>
+        <w:t>sleep_hours = [4, 5, 5, 6, 6, 7, 7, 8, 8, 9]</w:t>
       </w:r>
       <w:proofErr w:type="spellEnd"/>
       <w:r>
         <w:rPr>
           <w:rFonts w:ascii="Times New Roman" w:hAnsi="Times New Roman" w:cs="Times New Roman"/>
         </w:rPr>
-        <w:t xml:space="preserve"> = </w:t>
       </w:r>
       <w:proofErr w:type="spellStart"/>
       <w:proofErr w:type="gramStart"/>
@@ -256,7 +251,6 @@
         <w:rPr>
           <w:rFonts w:ascii="Times New Roman" w:hAnsi="Times New Roman" w:cs="Times New Roman"/>
         </w:rPr>
-        <w:t>pd.DataFrame</w:t>
       </w:r>
       <w:proofErr w:type="spellEnd"/>
       <w:proofErr w:type="gramEnd"/>
@@ -264,142 +258,137 @@
         <w:rPr>
           <w:rFonts w:ascii="Times New Roman" w:hAnsi="Times New Roman" w:cs="Times New Roman"/>
         </w:rPr>
-        <w:t>(data)</w:t>
-      </w:r>
-    </w:p>
-    <w:p>
-      <w:pPr>
-        <w:rPr>
-          <w:rFonts w:ascii="Times New Roman" w:hAnsi="Times New Roman" w:cs="Times New Roman"/>
-        </w:rPr>
-      </w:pPr>
-    </w:p>
-    <w:p>
-      <w:pPr>
-        <w:rPr>
-          <w:rFonts w:ascii="Times New Roman" w:hAnsi="Times New Roman" w:cs="Times New Roman"/>
-        </w:rPr>
-      </w:pPr>
-      <w:r>
-        <w:rPr>
-          <w:rFonts w:ascii="Times New Roman" w:hAnsi="Times New Roman" w:cs="Times New Roman"/>
-        </w:rPr>
-        <w:t># Display dataset</w:t>
-      </w:r>
-    </w:p>
-    <w:p>
-      <w:pPr>
-        <w:rPr>
-          <w:rFonts w:ascii="Times New Roman" w:hAnsi="Times New Roman" w:cs="Times New Roman"/>
-        </w:rPr>
-      </w:pPr>
-      <w:r>
-        <w:rPr>
-          <w:rFonts w:ascii="Times New Roman" w:hAnsi="Times New Roman" w:cs="Times New Roman"/>
-        </w:rPr>
-        <w:t>print("Dataset:")</w:t>
-      </w:r>
-    </w:p>
-    <w:p>
-      <w:pPr>
-        <w:rPr>
-          <w:rFonts w:ascii="Times New Roman" w:hAnsi="Times New Roman" w:cs="Times New Roman"/>
-        </w:rPr>
-      </w:pPr>
-      <w:r>
-        <w:rPr>
-          <w:rFonts w:ascii="Times New Roman" w:hAnsi="Times New Roman" w:cs="Times New Roman"/>
-        </w:rPr>
-        <w:t>print(</w:t>
+      </w:r>
+    </w:p>
+    <w:p>
+      <w:pPr>
+        <w:rPr>
+          <w:rFonts w:ascii="Times New Roman" w:hAnsi="Times New Roman" w:cs="Times New Roman"/>
+        </w:rPr>
+      </w:pPr>
+      <w:r>
+        <w:t>exam_scores  = [48, 55, 52, 61, 63, 70, 74, 80, 83, 91]</w:t>
+      </w:r>
+    </w:p>
+    <w:p>
+      <w:pPr>
+        <w:rPr>
+          <w:rFonts w:ascii="Times New Roman" w:hAnsi="Times New Roman" w:cs="Times New Roman"/>
+        </w:rPr>
+      </w:pPr>
+      <w:r>
+        <w:rPr>
+          <w:rFonts w:ascii="Times New Roman" w:hAnsi="Times New Roman" w:cs="Times New Roman"/>
+        </w:rPr>
+      </w:r>
+    </w:p>
+    <w:p>
+      <w:pPr>
+        <w:rPr>
+          <w:rFonts w:ascii="Times New Roman" w:hAnsi="Times New Roman" w:cs="Times New Roman"/>
+        </w:rPr>
+      </w:pPr>
+      <w:r>
+        <w:rPr>
+          <w:rFonts w:ascii="Times New Roman" w:hAnsi="Times New Roman" w:cs="Times New Roman"/>
+        </w:rPr>
+        <w:t>student_data = pd.DataFrame({</w:t>
+      </w:r>
+    </w:p>
+    <w:p>
+      <w:pPr>
+        <w:rPr>
+          <w:rFonts w:ascii="Times New Roman" w:hAnsi="Times New Roman" w:cs="Times New Roman"/>
+        </w:rPr>
+      </w:pPr>
+      <w:r>
+        <w:rPr>
+          <w:rFonts w:ascii="Times New Roman" w:hAnsi="Times New Roman" w:cs="Times New Roman"/>
+        </w:rPr>
+        <w:t xml:space="preserve">    "Sleep_Hours": sleep_hours,</w:t>
       </w:r>
       <w:proofErr w:type="spellStart"/>
       <w:r>
         <w:rPr>
           <w:rFonts w:ascii="Times New Roman" w:hAnsi="Times New Roman" w:cs="Times New Roman"/>
         </w:rPr>
-        <w:t>df</w:t>
       </w:r>
       <w:proofErr w:type="spellEnd"/>
       <w:r>
         <w:rPr>
           <w:rFonts w:ascii="Times New Roman" w:hAnsi="Times New Roman" w:cs="Times New Roman"/>
         </w:rPr>
-        <w:t>)</w:t>
-      </w:r>
-    </w:p>
-    <w:p>
-      <w:pPr>
-        <w:rPr>
-          <w:rFonts w:ascii="Times New Roman" w:hAnsi="Times New Roman" w:cs="Times New Roman"/>
-        </w:rPr>
-      </w:pPr>
-    </w:p>
-    <w:p>
-      <w:pPr>
-        <w:rPr>
-          <w:rFonts w:ascii="Times New Roman" w:hAnsi="Times New Roman" w:cs="Times New Roman"/>
-        </w:rPr>
-      </w:pPr>
-      <w:r>
-        <w:rPr>
-          <w:rFonts w:ascii="Times New Roman" w:hAnsi="Times New Roman" w:cs="Times New Roman"/>
-        </w:rPr>
-        <w:t># Calculate correlation</w:t>
-      </w:r>
-    </w:p>
-    <w:p>
-      <w:pPr>
-        <w:rPr>
-          <w:rFonts w:ascii="Times New Roman" w:hAnsi="Times New Roman" w:cs="Times New Roman"/>
-        </w:rPr>
-      </w:pPr>
-      <w:r>
-        <w:rPr>
-          <w:rFonts w:ascii="Times New Roman" w:hAnsi="Times New Roman" w:cs="Times New Roman"/>
-        </w:rPr>
-        <w:t xml:space="preserve">correlation = </w:t>
+      </w:r>
+    </w:p>
+    <w:p>
+      <w:pPr>
+        <w:rPr>
+          <w:rFonts w:ascii="Times New Roman" w:hAnsi="Times New Roman" w:cs="Times New Roman"/>
+        </w:rPr>
+      </w:pPr>
+      <w:r>
+        <w:t xml:space="preserve">    "Exam_Score" : exam_scores</w:t>
+      </w:r>
+    </w:p>
+    <w:p>
+      <w:pPr>
+        <w:rPr>
+          <w:rFonts w:ascii="Times New Roman" w:hAnsi="Times New Roman" w:cs="Times New Roman"/>
+        </w:rPr>
+      </w:pPr>
+      <w:r>
+        <w:rPr>
+          <w:rFonts w:ascii="Times New Roman" w:hAnsi="Times New Roman" w:cs="Times New Roman"/>
+        </w:rPr>
+        <w:t>})</w:t>
+      </w:r>
+    </w:p>
+    <w:p>
+      <w:pPr>
+        <w:rPr>
+          <w:rFonts w:ascii="Times New Roman" w:hAnsi="Times New Roman" w:cs="Times New Roman"/>
+        </w:rPr>
+      </w:pPr>
+      <w:r>
+        <w:rPr>
+          <w:rFonts w:ascii="Times New Roman" w:hAnsi="Times New Roman" w:cs="Times New Roman"/>
+        </w:rPr>
       </w:r>
       <w:proofErr w:type="spellStart"/>
       <w:r>
         <w:rPr>
           <w:rFonts w:ascii="Times New Roman" w:hAnsi="Times New Roman" w:cs="Times New Roman"/>
         </w:rPr>
-        <w:t>df</w:t>
       </w:r>
       <w:proofErr w:type="spellEnd"/>
       <w:r>
         <w:rPr>
           <w:rFonts w:ascii="Times New Roman" w:hAnsi="Times New Roman" w:cs="Times New Roman"/>
         </w:rPr>
-        <w:t>["</w:t>
       </w:r>
       <w:proofErr w:type="spellStart"/>
       <w:r>
         <w:rPr>
           <w:rFonts w:ascii="Times New Roman" w:hAnsi="Times New Roman" w:cs="Times New Roman"/>
         </w:rPr>
-        <w:t>Hours_Studied</w:t>
       </w:r>
       <w:proofErr w:type="spellEnd"/>
       <w:r>
         <w:rPr>
           <w:rFonts w:ascii="Times New Roman" w:hAnsi="Times New Roman" w:cs="Times New Roman"/>
         </w:rPr>
-        <w:t>"</w:t>
       </w:r>
       <w:proofErr w:type="gramStart"/>
       <w:r>
         <w:rPr>
           <w:rFonts w:ascii="Times New Roman" w:hAnsi="Times New Roman" w:cs="Times New Roman"/>
         </w:rPr>
-        <w:t>].</w:t>
       </w:r>
       <w:proofErr w:type="spellStart"/>
       <w:r>
         <w:rPr>
           <w:rFonts w:ascii="Times New Roman" w:hAnsi="Times New Roman" w:cs="Times New Roman"/>
         </w:rPr>
-        <w:t>corr</w:t>
       </w:r>
       <w:proofErr w:type="spellEnd"/>
       <w:proofErr w:type="gramEnd"/>
@@ -407,29 +396,29 @@
         <w:rPr>
           <w:rFonts w:ascii="Times New Roman" w:hAnsi="Times New Roman" w:cs="Times New Roman"/>
         </w:rPr>
-        <w:t>(</w:t>
       </w:r>
       <w:proofErr w:type="spellStart"/>
       <w:r>
         <w:rPr>
           <w:rFonts w:ascii="Times New Roman" w:hAnsi="Times New Roman" w:cs="Times New Roman"/>
         </w:rPr>
-        <w:t>df</w:t>
       </w:r>
       <w:proofErr w:type="spellEnd"/>
       <w:r>
         <w:rPr>
           <w:rFonts w:ascii="Times New Roman" w:hAnsi="Times New Roman" w:cs="Times New Roman"/>
         </w:rPr>
-        <w:t>["Marks"])</w:t>
-      </w:r>
-    </w:p>
-    <w:p>
-      <w:pPr>
-        <w:rPr>
-          <w:rFonts w:ascii="Times New Roman" w:hAnsi="Times New Roman" w:cs="Times New Roman"/>
-        </w:rPr>
-      </w:pPr>
+      </w:r>
+    </w:p>
+    <w:p>
+      <w:pPr>
+        <w:rPr>
+          <w:rFonts w:ascii="Times New Roman" w:hAnsi="Times New Roman" w:cs="Times New Roman"/>
+        </w:rPr>
+      </w:pPr>
+      <w:r>
+        <w:t>print('Student Performance Dataset:')</w:t>
+      </w:r>
     </w:p>
     <w:p>
       <w:pPr>
@@ -442,61 +431,60 @@
         <w:rPr>
           <w:rFonts w:ascii="Times New Roman" w:hAnsi="Times New Roman" w:cs="Times New Roman"/>
         </w:rPr>
-        <w:t>print(</w:t>
+        <w:t>print(student_data.to_string(index=False))</w:t>
       </w:r>
       <w:proofErr w:type="gramEnd"/>
       <w:r>
         <w:rPr>
           <w:rFonts w:ascii="Times New Roman" w:hAnsi="Times New Roman" w:cs="Times New Roman"/>
         </w:rPr>
-        <w:t>"\</w:t>
       </w:r>
       <w:proofErr w:type="spellStart"/>
       <w:r>
         <w:rPr>
           <w:rFonts w:ascii="Times New Roman" w:hAnsi="Times New Roman" w:cs="Times New Roman"/>
         </w:rPr>
-        <w:t>nCorrelation</w:t>
       </w:r>
       <w:proofErr w:type="spellEnd"/>
       <w:r>
         <w:rPr>
           <w:rFonts w:ascii="Times New Roman" w:hAnsi="Times New Roman" w:cs="Times New Roman"/>
         </w:rPr>
-        <w:t xml:space="preserve"> between Hours Studied and Marks:")</w:t>
-      </w:r>
-    </w:p>
-    <w:p>
-      <w:pPr>
-        <w:rPr>
-          <w:rFonts w:ascii="Times New Roman" w:hAnsi="Times New Roman" w:cs="Times New Roman"/>
-        </w:rPr>
-      </w:pPr>
-      <w:r>
-        <w:rPr>
-          <w:rFonts w:ascii="Times New Roman" w:hAnsi="Times New Roman" w:cs="Times New Roman"/>
-        </w:rPr>
-        <w:t>print(correlation)</w:t>
-      </w:r>
-    </w:p>
-    <w:p>
-      <w:pPr>
-        <w:rPr>
-          <w:rFonts w:ascii="Times New Roman" w:hAnsi="Times New Roman" w:cs="Times New Roman"/>
-        </w:rPr>
-      </w:pPr>
-    </w:p>
-    <w:p>
-      <w:pPr>
-        <w:rPr>
-          <w:rFonts w:ascii="Times New Roman" w:hAnsi="Times New Roman" w:cs="Times New Roman"/>
-        </w:rPr>
-      </w:pPr>
-      <w:r>
-        <w:rPr>
-          <w:rFonts w:ascii="Times New Roman" w:hAnsi="Times New Roman" w:cs="Times New Roman"/>
-        </w:rPr>
-        <w:t># Plot relationship</w:t>
+      </w:r>
+    </w:p>
+    <w:p>
+      <w:pPr>
+        <w:rPr>
+          <w:rFonts w:ascii="Times New Roman" w:hAnsi="Times New Roman" w:cs="Times New Roman"/>
+        </w:rPr>
+      </w:pPr>
+      <w:r>
+        <w:rPr>
+          <w:rFonts w:ascii="Times New Roman" w:hAnsi="Times New Roman" w:cs="Times New Roman"/>
+        </w:rPr>
+      </w:r>
+    </w:p>
+    <w:p>
+      <w:pPr>
+        <w:rPr>
+          <w:rFonts w:ascii="Times New Roman" w:hAnsi="Times New Roman" w:cs="Times New Roman"/>
+        </w:rPr>
+      </w:pPr>
+      <w:r>
+        <w:t># Step 2: Compute Pearson Correlation Coefficient</w:t>
+      </w:r>
+    </w:p>
+    <w:p>
+      <w:pPr>
+        <w:rPr>
+          <w:rFonts w:ascii="Times New Roman" w:hAnsi="Times New Roman" w:cs="Times New Roman"/>
+        </w:rPr>
+      </w:pPr>
+      <w:r>
+        <w:rPr>
+          <w:rFonts w:ascii="Times New Roman" w:hAnsi="Times New Roman" w:cs="Times New Roman"/>
+        </w:rPr>
+        <w:t>r = student_data["Sleep_Hours"].corr(student_data["Exam_Score"])</w:t>
       </w:r>
     </w:p>
     <w:p>
@@ -511,7 +499,6 @@
         <w:rPr>
           <w:rFonts w:ascii="Times New Roman" w:hAnsi="Times New Roman" w:cs="Times New Roman"/>
         </w:rPr>
-        <w:t>sns.scatterplot</w:t>
       </w:r>
       <w:proofErr w:type="spellEnd"/>
       <w:proofErr w:type="gramEnd"/>
@@ -519,68 +506,62 @@
         <w:rPr>
           <w:rFonts w:ascii="Times New Roman" w:hAnsi="Times New Roman" w:cs="Times New Roman"/>
         </w:rPr>
-        <w:t>(</w:t>
-      </w:r>
-    </w:p>
-    <w:p>
-      <w:pPr>
-        <w:rPr>
-          <w:rFonts w:ascii="Times New Roman" w:hAnsi="Times New Roman" w:cs="Times New Roman"/>
-        </w:rPr>
-      </w:pPr>
-      <w:r>
-        <w:rPr>
-          <w:rFonts w:ascii="Times New Roman" w:hAnsi="Times New Roman" w:cs="Times New Roman"/>
-        </w:rPr>
-        <w:t>    x="</w:t>
+      </w:r>
+    </w:p>
+    <w:p>
+      <w:pPr>
+        <w:rPr>
+          <w:rFonts w:ascii="Times New Roman" w:hAnsi="Times New Roman" w:cs="Times New Roman"/>
+        </w:rPr>
+      </w:pPr>
+      <w:r>
+        <w:rPr>
+          <w:rFonts w:ascii="Times New Roman" w:hAnsi="Times New Roman" w:cs="Times New Roman"/>
+        </w:rPr>
+        <w:t>print('\nCorrelation between Sleep Hours and Exam Score:')</w:t>
       </w:r>
       <w:proofErr w:type="spellStart"/>
       <w:r>
         <w:rPr>
           <w:rFonts w:ascii="Times New Roman" w:hAnsi="Times New Roman" w:cs="Times New Roman"/>
         </w:rPr>
-        <w:t>Hours_Studied</w:t>
       </w:r>
       <w:proofErr w:type="spellEnd"/>
       <w:r>
         <w:rPr>
           <w:rFonts w:ascii="Times New Roman" w:hAnsi="Times New Roman" w:cs="Times New Roman"/>
         </w:rPr>
-        <w:t>",</w:t>
-      </w:r>
-    </w:p>
-    <w:p>
-      <w:pPr>
-        <w:rPr>
-          <w:rFonts w:ascii="Times New Roman" w:hAnsi="Times New Roman" w:cs="Times New Roman"/>
-        </w:rPr>
-      </w:pPr>
-      <w:r>
-        <w:rPr>
-          <w:rFonts w:ascii="Times New Roman" w:hAnsi="Times New Roman" w:cs="Times New Roman"/>
-        </w:rPr>
-        <w:lastRenderedPageBreak/>
-        <w:t>    y="Marks",</w:t>
-      </w:r>
-    </w:p>
-    <w:p>
-      <w:pPr>
-        <w:rPr>
-          <w:rFonts w:ascii="Times New Roman" w:hAnsi="Times New Roman" w:cs="Times New Roman"/>
-        </w:rPr>
-      </w:pPr>
-      <w:r>
-        <w:rPr>
-          <w:rFonts w:ascii="Times New Roman" w:hAnsi="Times New Roman" w:cs="Times New Roman"/>
-        </w:rPr>
-        <w:t>    data=</w:t>
+      </w:r>
+    </w:p>
+    <w:p>
+      <w:pPr>
+        <w:rPr>
+          <w:rFonts w:ascii="Times New Roman" w:hAnsi="Times New Roman" w:cs="Times New Roman"/>
+        </w:rPr>
+      </w:pPr>
+      <w:r>
+        <w:rPr>
+          <w:rFonts w:ascii="Times New Roman" w:hAnsi="Times New Roman" w:cs="Times New Roman"/>
+        </w:rPr>
+        <w:t>print(r)</w:t>
+      </w:r>
+    </w:p>
+    <w:p>
+      <w:pPr>
+        <w:rPr>
+          <w:rFonts w:ascii="Times New Roman" w:hAnsi="Times New Roman" w:cs="Times New Roman"/>
+        </w:rPr>
+      </w:pPr>
+      <w:r>
+        <w:rPr>
+          <w:rFonts w:ascii="Times New Roman" w:hAnsi="Times New Roman" w:cs="Times New Roman"/>
+        </w:rPr>
       </w:r>
       <w:proofErr w:type="spellStart"/>
       <w:r>
         <w:rPr>
           <w:rFonts w:ascii="Times New Roman" w:hAnsi="Times New Roman" w:cs="Times New Roman"/>
         </w:rPr>
-        <w:t>df</w:t>
       </w:r>
       <w:proofErr w:type="spellEnd"/>
     </w:p>
@@ -594,15 +575,18 @@
         <w:rPr>
           <w:rFonts w:ascii="Times New Roman" w:hAnsi="Times New Roman" w:cs="Times New Roman"/>
         </w:rPr>
-        <w:t>)</w:t>
-      </w:r>
-    </w:p>
-    <w:p>
-      <w:pPr>
-        <w:rPr>
-          <w:rFonts w:ascii="Times New Roman" w:hAnsi="Times New Roman" w:cs="Times New Roman"/>
-        </w:rPr>
-      </w:pPr>
+        <w:t># Step 3: Visualize the association</w:t>
+      </w:r>
+    </w:p>
+    <w:p>
+      <w:pPr>
+        <w:rPr>
+          <w:rFonts w:ascii="Times New Roman" w:hAnsi="Times New Roman" w:cs="Times New Roman"/>
+        </w:rPr>
+      </w:pPr>
+      <w:r>
+        <w:t>plt.figure(figsize=(7, 5))</w:t>
+      </w:r>
     </w:p>
     <w:p>
       <w:pPr>
@@ -616,7 +600,7 @@
         <w:rPr>
           <w:rFonts w:ascii="Times New Roman" w:hAnsi="Times New Roman" w:cs="Times New Roman"/>
         </w:rPr>
-        <w:t>plt.title</w:t>
+        <w:t>sns.scatterplot(</w:t>
       </w:r>
       <w:proofErr w:type="spellEnd"/>
       <w:proofErr w:type="gramEnd"/>
@@ -624,7 +608,6 @@
         <w:rPr>
           <w:rFonts w:ascii="Times New Roman" w:hAnsi="Times New Roman" w:cs="Times New Roman"/>
         </w:rPr>
-        <w:t>("Association Between Hours Studied and Marks")</w:t>
       </w:r>
     </w:p>
     <w:p>
@@ -639,7 +622,7 @@
         <w:rPr>
           <w:rFonts w:ascii="Times New Roman" w:hAnsi="Times New Roman" w:cs="Times New Roman"/>
         </w:rPr>
-        <w:t>plt.xlabel</w:t>
+        <w:t xml:space="preserve">    data=student_data,</w:t>
       </w:r>
       <w:proofErr w:type="spellEnd"/>
       <w:proofErr w:type="gramEnd"/>
@@ -647,7 +630,6 @@
         <w:rPr>
           <w:rFonts w:ascii="Times New Roman" w:hAnsi="Times New Roman" w:cs="Times New Roman"/>
         </w:rPr>
-        <w:t>("Hours Studied (Independent Variable)")</w:t>
       </w:r>
     </w:p>
     <w:p>
@@ -662,7 +644,7 @@
         <w:rPr>
           <w:rFonts w:ascii="Times New Roman" w:hAnsi="Times New Roman" w:cs="Times New Roman"/>
         </w:rPr>
-        <w:t>plt.ylabel</w:t>
+        <w:t xml:space="preserve">    x="Sleep_Hours",</w:t>
       </w:r>
       <w:proofErr w:type="spellEnd"/>
       <w:proofErr w:type="gramEnd"/>
@@ -670,7 +652,6 @@
         <w:rPr>
           <w:rFonts w:ascii="Times New Roman" w:hAnsi="Times New Roman" w:cs="Times New Roman"/>
         </w:rPr>
-        <w:t>("Marks (Dependent Variable)")</w:t>
       </w:r>
     </w:p>
     <w:p>
@@ -685,7 +666,7 @@
         <w:rPr>
           <w:rFonts w:ascii="Times New Roman" w:hAnsi="Times New Roman" w:cs="Times New Roman"/>
         </w:rPr>
-        <w:t>plt.show</w:t>
+        <w:t xml:space="preserve">    y="Exam_Score",</w:t>
       </w:r>
       <w:proofErr w:type="spellEnd"/>
       <w:proofErr w:type="gramEnd"/>
@@ -693,15 +674,17 @@
         <w:rPr>
           <w:rFonts w:ascii="Times New Roman" w:hAnsi="Times New Roman" w:cs="Times New Roman"/>
         </w:rPr>
-        <w:t>()</w:t>
-      </w:r>
-    </w:p>
-    <w:p>
-      <w:pPr>
-        <w:rPr>
-          <w:rFonts w:ascii="Times New Roman" w:hAnsi="Times New Roman" w:cs="Times New Roman"/>
-        </w:rPr>
-      </w:pPr>
+      </w:r>
+    </w:p>
+    <w:p>
+      <w:pPr>
+        <w:rPr>
+          <w:rFonts w:ascii="Times New Roman" w:hAnsi="Times New Roman" w:cs="Times New Roman"/>
+        </w:rPr>
+      </w:pPr>
+      <w:r>
+        <w:t xml:space="preserve">    color="steelblue",</w:t>
+      </w:r>
     </w:p>
     <w:p>
       <w:pPr>
@@ -721,7 +704,7 @@
           <w:sz w:val="28"/>
           <w:szCs w:val="28"/>
         </w:rPr>
-        <w:t>Output:</w:t>
+        <w:t xml:space="preserve">    s=80</w:t>
       </w:r>
     </w:p>
     <w:p>
@@ -743,47 +726,7 @@
           <w:sz w:val="28"/>
           <w:szCs w:val="28"/>
         </w:rPr>
-        <w:drawing>
-          <wp:inline distT="0" distB="0" distL="0" distR="0" wp14:anchorId="3B157E70" wp14:editId="29E5F2D4">
-            <wp:extent cx="5731510" cy="4850130"/>
-            <wp:effectExtent l="0" t="0" r="2540" b="7620"/>
-            <wp:docPr id="452266963" name="Picture 3"/>
-            <wp:cNvGraphicFramePr>
-              <a:graphicFrameLocks xmlns:a="http://schemas.openxmlformats.org/drawingml/2006/main" noChangeAspect="1"/>
-            </wp:cNvGraphicFramePr>
-            <a:graphic xmlns:a="http://schemas.openxmlformats.org/drawingml/2006/main">
-              <a:graphicData uri="http://schemas.openxmlformats.org/drawingml/2006/picture">
-                <pic:pic xmlns:pic="http://schemas.openxmlformats.org/drawingml/2006/picture">
-                  <pic:nvPicPr>
-                    <pic:cNvPr id="452266963" name="Picture 452266963"/>
-                    <pic:cNvPicPr/>
-                  </pic:nvPicPr>
-                  <pic:blipFill>
-                    <a:blip r:embed="rId4">
-                      <a:extLst>
-                        <a:ext uri="{28A0092B-C50C-407E-A947-70E740481C1C}">
-                          <a14:useLocalDpi xmlns:a14="http://schemas.microsoft.com/office/drawing/2010/main" val="0"/>
-                        </a:ext>
-                      </a:extLst>
-                    </a:blip>
-                    <a:stretch>
-                      <a:fillRect/>
-                    </a:stretch>
-                  </pic:blipFill>
-                  <pic:spPr>
-                    <a:xfrm>
-                      <a:off x="0" y="0"/>
-                      <a:ext cx="5731510" cy="4850130"/>
-                    </a:xfrm>
-                    <a:prstGeom prst="rect">
-                      <a:avLst/>
-                    </a:prstGeom>
-                  </pic:spPr>
-                </pic:pic>
-              </a:graphicData>
-            </a:graphic>
-          </wp:inline>
-        </w:drawing>
+        <w:t>)</w:t>
       </w:r>
     </w:p>
     <w:p>
@@ -805,48 +748,137 @@
           <w:sz w:val="28"/>
           <w:szCs w:val="28"/>
         </w:rPr>
-        <w:lastRenderedPageBreak/>
-        <w:drawing>
-          <wp:inline distT="0" distB="0" distL="0" distR="0" wp14:anchorId="63129672" wp14:editId="3F9098C9">
-            <wp:extent cx="4922947" cy="3063505"/>
-            <wp:effectExtent l="0" t="0" r="0" b="3810"/>
-            <wp:docPr id="126538746" name="Picture 4"/>
-            <wp:cNvGraphicFramePr>
-              <a:graphicFrameLocks xmlns:a="http://schemas.openxmlformats.org/drawingml/2006/main" noChangeAspect="1"/>
-            </wp:cNvGraphicFramePr>
-            <a:graphic xmlns:a="http://schemas.openxmlformats.org/drawingml/2006/main">
-              <a:graphicData uri="http://schemas.openxmlformats.org/drawingml/2006/picture">
-                <pic:pic xmlns:pic="http://schemas.openxmlformats.org/drawingml/2006/picture">
-                  <pic:nvPicPr>
-                    <pic:cNvPr id="126538746" name="Picture 126538746"/>
-                    <pic:cNvPicPr/>
-                  </pic:nvPicPr>
-                  <pic:blipFill>
-                    <a:blip r:embed="rId5">
-                      <a:extLst>
-                        <a:ext uri="{28A0092B-C50C-407E-A947-70E740481C1C}">
-                          <a14:useLocalDpi xmlns:a14="http://schemas.microsoft.com/office/drawing/2010/main" val="0"/>
-                        </a:ext>
-                      </a:extLst>
-                    </a:blip>
-                    <a:stretch>
-                      <a:fillRect/>
-                    </a:stretch>
-                  </pic:blipFill>
-                  <pic:spPr>
-                    <a:xfrm>
-                      <a:off x="0" y="0"/>
-                      <a:ext cx="4922947" cy="3063505"/>
-                    </a:xfrm>
-                    <a:prstGeom prst="rect">
-                      <a:avLst/>
-                    </a:prstGeom>
-                  </pic:spPr>
-                </pic:pic>
-              </a:graphicData>
-            </a:graphic>
-          </wp:inline>
-        </w:drawing>
+      </w:r>
+    </w:p>
+    <w:p>
+      <w:pPr>
+        <w:rPr>
+          <w:rFonts w:ascii="Times New Roman" w:hAnsi="Times New Roman" w:cs="Times New Roman"/>
+          <w:b/>
+          <w:bCs/>
+          <w:sz w:val="28"/>
+          <w:szCs w:val="28"/>
+        </w:rPr>
+      </w:pPr>
+      <w:r>
+        <w:rPr>
+          <w:rFonts w:ascii="Times New Roman" w:hAnsi="Times New Roman" w:cs="Times New Roman"/>
+          <w:b/>
+          <w:bCs/>
+          <w:noProof/>
+          <w:sz w:val="28"/>
+          <w:szCs w:val="28"/>
+        </w:rPr>
+        <w:t>plt.title('Association Between Sleep Hours and Exam Score')</w:t>
+      </w:r>
+    </w:p>
+    <w:p>
+      <w:pPr>
+        <w:rPr>
+          <w:rFonts w:ascii="Times New Roman" w:hAnsi="Times New Roman" w:cs="Times New Roman"/>
+          <w:b/>
+          <w:bCs/>
+          <w:sz w:val="28"/>
+          <w:szCs w:val="28"/>
+        </w:rPr>
+      </w:pPr>
+      <w:r>
+        <w:rPr>
+          <w:rFonts w:ascii="Times New Roman" w:hAnsi="Times New Roman" w:cs="Times New Roman"/>
+          <w:b/>
+          <w:bCs/>
+          <w:noProof/>
+          <w:sz w:val="28"/>
+          <w:szCs w:val="28"/>
+        </w:rPr>
+        <w:t>plt.xlabel('Sleep Hours (Independent Variable)')</w:t>
+      </w:r>
+    </w:p>
+    <w:p>
+      <w:pPr>
+        <w:rPr>
+          <w:rFonts w:ascii="Times New Roman" w:hAnsi="Times New Roman" w:cs="Times New Roman"/>
+          <w:b/>
+          <w:bCs/>
+          <w:sz w:val="28"/>
+          <w:szCs w:val="28"/>
+        </w:rPr>
+      </w:pPr>
+      <w:r>
+        <w:rPr>
+          <w:rFonts w:ascii="Times New Roman" w:hAnsi="Times New Roman" w:cs="Times New Roman"/>
+          <w:b/>
+          <w:bCs/>
+          <w:noProof/>
+          <w:sz w:val="28"/>
+          <w:szCs w:val="28"/>
+        </w:rPr>
+        <w:t>plt.ylabel('Exam Score (Dependent Variable)')</w:t>
+      </w:r>
+    </w:p>
+    <w:p>
+      <w:pPr>
+        <w:rPr>
+          <w:rFonts w:ascii="Times New Roman" w:hAnsi="Times New Roman" w:cs="Times New Roman"/>
+          <w:b/>
+          <w:bCs/>
+          <w:sz w:val="28"/>
+          <w:szCs w:val="28"/>
+        </w:rPr>
+      </w:pPr>
+      <w:r>
+        <w:rPr>
+          <w:rFonts w:ascii="Times New Roman" w:hAnsi="Times New Roman" w:cs="Times New Roman"/>
+          <w:b/>
+          <w:bCs/>
+          <w:noProof/>
+          <w:sz w:val="28"/>
+          <w:szCs w:val="28"/>
+        </w:rPr>
+        <w:t>plt.tight_layout()</w:t>
+      </w:r>
+    </w:p>
+    <w:p>
+      <w:pPr>
+        <w:rPr>
+          <w:rFonts w:ascii="Times New Roman" w:hAnsi="Times New Roman" w:cs="Times New Roman"/>
+          <w:b/>
+          <w:bCs/>
+          <w:sz w:val="28"/>
+          <w:szCs w:val="28"/>
+        </w:rPr>
+      </w:pPr>
+      <w:r>
+        <w:rPr>
+          <w:rFonts w:ascii="Times New Roman" w:hAnsi="Times New Roman" w:cs="Times New Roman"/>
+          <w:b/>
+          <w:bCs/>
+          <w:noProof/>
+          <w:sz w:val="28"/>
+          <w:szCs w:val="28"/>
+        </w:rPr>
+        <w:t>plt.show()</w:t>
+      </w:r>
+    </w:p>
+    <w:p>
+      <w:pPr>
+        <w:rPr>
+          <w:rFonts w:ascii="Times New Roman" w:hAnsi="Times New Roman" w:cs="Times New Roman"/>
+          <w:b/>
+          <w:bCs/>
+          <w:sz w:val="28"/>
+          <w:szCs w:val="28"/>
+        </w:rPr>
+      </w:pPr>
+      <w:r>
+        <w:rPr>
+          <w:rFonts w:ascii="Times New Roman" w:hAnsi="Times New Roman" w:cs="Times New Roman"/>
+          <w:b/>
+          <w:bCs/>
+          <w:noProof/>
+          <w:sz w:val="28"/>
+          <w:szCs w:val="28"/>
+        </w:rPr>
       </w:r>
     </w:p>
     <w:sectPr>

</xml_diff>